<commit_message>
Updated things to match better with other stuff
</commit_message>
<xml_diff>
--- a/📑 Technical Report.docx
+++ b/📑 Technical Report.docx
@@ -22,7 +22,14 @@
           <w:b/>
           <w:bCs/>
         </w:rPr>
-        <w:t xml:space="preserve"> Technical Report: Drone Security Analyst Agent (v2.0)</w:t>
+        <w:t xml:space="preserve"> Technical Report: </w:t>
+      </w:r>
+      <w:r>
+        <w:rPr>
+          <w:b/>
+          <w:bCs/>
+        </w:rPr>
+        <w:t>Drone Sentinel AI (v2.0)</w:t>
       </w:r>
     </w:p>
     <w:p>
@@ -64,7 +71,7 @@
     <w:p>
       <w:r>
         <w:pict w14:anchorId="3806461B">
-          <v:rect id="_x0000_i1034" style="width:0;height:1.5pt" o:hralign="center" o:hrstd="t" o:hr="t" fillcolor="#a0a0a0" stroked="f"/>
+          <v:rect id="_x0000_i1025" style="width:0;height:1.5pt" o:hralign="center" o:hrstd="t" o:hr="t" fillcolor="#a0a0a0" stroked="f"/>
         </w:pict>
       </w:r>
     </w:p>
@@ -189,8 +196,13 @@
         <w:t>. The system now verifies file existence (</w:t>
       </w:r>
       <w:proofErr w:type="spellStart"/>
-      <w:r>
-        <w:t>os.path.exists</w:t>
+      <w:proofErr w:type="gramStart"/>
+      <w:r>
+        <w:t>os.path</w:t>
+      </w:r>
+      <w:proofErr w:type="gramEnd"/>
+      <w:r>
+        <w:t>.exists</w:t>
       </w:r>
       <w:proofErr w:type="spellEnd"/>
       <w:r>
@@ -327,18 +339,22 @@
         <w:t xml:space="preserve"> By using </w:t>
       </w:r>
       <w:proofErr w:type="spellStart"/>
+      <w:proofErr w:type="gramStart"/>
       <w:r>
         <w:t>json.dumps</w:t>
       </w:r>
       <w:proofErr w:type="spellEnd"/>
+      <w:proofErr w:type="gramEnd"/>
       <w:r>
         <w:t xml:space="preserve">() for storage and </w:t>
       </w:r>
       <w:proofErr w:type="spellStart"/>
+      <w:proofErr w:type="gramStart"/>
       <w:r>
         <w:t>json.loads</w:t>
       </w:r>
       <w:proofErr w:type="spellEnd"/>
+      <w:proofErr w:type="gramEnd"/>
       <w:r>
         <w:t>() for retrieval, the system now handles high-dimensional data (multiple objects/</w:t>
       </w:r>

</xml_diff>